<commit_message>
Rename Sizify to Sizeify inside PRD docx
Replace 7 occurrences (6 in document.xml, 1 in header1.xml) inside the Word
document so the rename is complete. Zip entry order and per-entry compression
preserved.

Co-Authored-By: Claude Opus 4.7 <noreply@anthropic.com>
</commit_message>
<xml_diff>
--- a/docs/Sizeify_PRD_v1.docx
+++ b/docs/Sizeify_PRD_v1.docx
@@ -30,7 +30,7 @@
           <w:sz w:val="64"/>
           <w:szCs w:val="64"/>
         </w:rPr>
-        <w:t xml:space="preserve">Sizify</w:t>
+        <w:t xml:space="preserve">Sizeify</w:t>
       </w:r>
     </w:p>
     <w:p>
@@ -98,7 +98,7 @@
         <w:jc w:val="both"/>
       </w:pPr>
       <w:r>
-        <w:t xml:space="preserve">Sizify is a mobile application that solves a single, focused problem: predicting what size of any garment a user should buy in any brand to achieve a fit comparable to garments they already own and like. It eliminates the guesswork that drives the ~30% return rate on online clothing purchases, where sizing is consistently the top-cited reason for returns.</w:t>
+        <w:t xml:space="preserve">Sizeify is a mobile application that solves a single, focused problem: predicting what size of any garment a user should buy in any brand to achieve a fit comparable to garments they already own and like. It eliminates the guesswork that drives the ~30% return rate on online clothing purchases, where sizing is consistently the top-cited reason for returns.</w:t>
       </w:r>
     </w:p>
     <w:p>
@@ -842,7 +842,7 @@
         <w:spacing w:after="80"/>
       </w:pPr>
       <w:r>
-        <w:t xml:space="preserve">As a user browsing a retailer's website, I can tap the share button and select Sizify.</w:t>
+        <w:t xml:space="preserve">As a user browsing a retailer's website, I can tap the share button and select Sizeify.</w:t>
       </w:r>
     </w:p>
     <w:p>
@@ -1619,7 +1619,7 @@
         <w:jc w:val="both"/>
       </w:pPr>
       <w:r>
-        <w:t xml:space="preserve">The share-sheet flow is the primary discovery mechanism for the app's value. Users encounter clothing in their browser, on Instagram, on TikTok, in messages, and in any other context where the OS share sheet is available. By making Sizify appear in that share sheet, the app meets users in their existing shopping flow rather than asking them to switch contexts.</w:t>
+        <w:t xml:space="preserve">The share-sheet flow is the primary discovery mechanism for the app's value. Users encounter clothing in their browser, on Instagram, on TikTok, in messages, and in any other context where the OS share sheet is available. By making Sizeify appear in that share sheet, the app meets users in their existing shopping flow rather than asking them to switch contexts.</w:t>
       </w:r>
     </w:p>
     <w:p>
@@ -1653,7 +1653,7 @@
         <w:spacing w:after="80"/>
       </w:pPr>
       <w:r>
-        <w:t xml:space="preserve">Sizify appears in the share sheet (registered via iOS Share Extension and Android Share Intent).</w:t>
+        <w:t xml:space="preserve">Sizeify appears in the share sheet (registered via iOS Share Extension and Android Share Intent).</w:t>
       </w:r>
     </w:p>
     <w:p>
@@ -1666,7 +1666,7 @@
         <w:spacing w:after="80"/>
       </w:pPr>
       <w:r>
-        <w:t xml:space="preserve">User selects Sizify. The app receives the URL via the OS share intent, displays a brief confirmation toast ("Got it — checking sizes"), and immediately backgrounds itself.</w:t>
+        <w:t xml:space="preserve">User selects Sizeify. The app receives the URL via the OS share intent, displays a brief confirmation toast ("Got it — checking sizes"), and immediately backgrounds itself.</w:t>
       </w:r>
     </w:p>
     <w:p>
@@ -5889,7 +5889,7 @@
         <w:sz w:val="18"/>
         <w:szCs w:val="18"/>
       </w:rPr>
-      <w:t xml:space="preserve">Sizify PRD v1.0</w:t>
+      <w:t xml:space="preserve">Sizeify PRD v1.0</w:t>
     </w:r>
   </w:p>
 </w:hdr>

</xml_diff>